<commit_message>
almost ready to roll
</commit_message>
<xml_diff>
--- a/docs/SAIGE-RAGE-Whitepaper.docx
+++ b/docs/SAIGE-RAGE-Whitepaper.docx
@@ -8,115 +8,11 @@
       </w:pPr>
       <w:r>
         <w:rPr>
-          <w:noProof/>
-        </w:rPr>
-        <w:drawing>
-          <wp:anchor distT="0" distB="0" distL="114300" distR="114300" simplePos="0" relativeHeight="251656704" behindDoc="1" locked="0" layoutInCell="1" allowOverlap="1" wp14:anchorId="6CED21EA" wp14:editId="5A46D7CE">
-            <wp:simplePos x="0" y="0"/>
-            <wp:positionH relativeFrom="column">
-              <wp:posOffset>4191000</wp:posOffset>
-            </wp:positionH>
-            <wp:positionV relativeFrom="paragraph">
-              <wp:posOffset>381000</wp:posOffset>
-            </wp:positionV>
-            <wp:extent cx="2861787" cy="2593498"/>
-            <wp:effectExtent l="0" t="0" r="0" b="0"/>
-            <wp:wrapNone/>
-            <wp:docPr id="39184964" name="Picture 1"/>
-            <wp:cNvGraphicFramePr>
-              <a:graphicFrameLocks xmlns:a="http://schemas.openxmlformats.org/drawingml/2006/main" noChangeAspect="1"/>
-            </wp:cNvGraphicFramePr>
-            <a:graphic xmlns:a="http://schemas.openxmlformats.org/drawingml/2006/main">
-              <a:graphicData uri="http://schemas.openxmlformats.org/drawingml/2006/picture">
-                <pic:pic xmlns:pic="http://schemas.openxmlformats.org/drawingml/2006/picture">
-                  <pic:nvPicPr>
-                    <pic:cNvPr id="39184964" name="Picture 39184964"/>
-                    <pic:cNvPicPr/>
-                  </pic:nvPicPr>
-                  <pic:blipFill>
-                    <a:blip r:embed="rId8">
-                      <a:duotone>
-                        <a:prstClr val="black"/>
-                        <a:schemeClr val="accent6">
-                          <a:tint val="45000"/>
-                          <a:satMod val="400000"/>
-                        </a:schemeClr>
-                      </a:duotone>
-                      <a:alphaModFix amt="35000"/>
-                      <a:extLst>
-                        <a:ext uri="{BEBA8EAE-BF5A-486C-A8C5-ECC9F3942E4B}">
-                          <a14:imgProps xmlns:a14="http://schemas.microsoft.com/office/drawing/2010/main">
-                            <a14:imgLayer r:embed="rId9">
-                              <a14:imgEffect>
-                                <a14:artisticPlasticWrap/>
-                              </a14:imgEffect>
-                              <a14:imgEffect>
-                                <a14:sharpenSoften amount="50000"/>
-                              </a14:imgEffect>
-                              <a14:imgEffect>
-                                <a14:colorTemperature colorTemp="6501"/>
-                              </a14:imgEffect>
-                              <a14:imgEffect>
-                                <a14:saturation sat="33000"/>
-                              </a14:imgEffect>
-                              <a14:imgEffect>
-                                <a14:brightnessContrast bright="20000" contrast="-29000"/>
-                              </a14:imgEffect>
-                            </a14:imgLayer>
-                          </a14:imgProps>
-                        </a:ext>
-                      </a:extLst>
-                    </a:blip>
-                    <a:stretch>
-                      <a:fillRect/>
-                    </a:stretch>
-                  </pic:blipFill>
-                  <pic:spPr>
-                    <a:xfrm>
-                      <a:off x="0" y="0"/>
-                      <a:ext cx="2861787" cy="2593498"/>
-                    </a:xfrm>
-                    <a:prstGeom prst="rect">
-                      <a:avLst/>
-                    </a:prstGeom>
-                    <a:ln>
-                      <a:noFill/>
-                    </a:ln>
-                    <a:effectLst>
-                      <a:outerShdw blurRad="190500" algn="tl" rotWithShape="0">
-                        <a:srgbClr val="000000">
-                          <a:alpha val="70000"/>
-                        </a:srgbClr>
-                      </a:outerShdw>
-                    </a:effectLst>
-                  </pic:spPr>
-                </pic:pic>
-              </a:graphicData>
-            </a:graphic>
-            <wp14:sizeRelH relativeFrom="margin">
-              <wp14:pctWidth>0</wp14:pctWidth>
-            </wp14:sizeRelH>
-            <wp14:sizeRelV relativeFrom="margin">
-              <wp14:pctHeight>0</wp14:pctHeight>
-            </wp14:sizeRelV>
-          </wp:anchor>
-        </w:drawing>
-      </w:r>
-      <w:r>
-        <w:rPr>
           <w:rFonts w:ascii="Aptos Display" w:eastAsia="Aptos Display" w:hAnsi="Aptos Display"/>
           <w:b/>
           <w:sz w:val="48"/>
         </w:rPr>
-        <w:t xml:space="preserve">Secure AI Guardrail Enforcement </w:t>
-      </w:r>
-      <w:r>
-        <w:rPr>
-          <w:rFonts w:ascii="Aptos Display" w:eastAsia="Aptos Display" w:hAnsi="Aptos Display"/>
-          <w:b/>
-          <w:sz w:val="48"/>
-        </w:rPr>
-        <w:t xml:space="preserve">(SAIGE) </w:t>
+        <w:t xml:space="preserve">Secure AI Guardrail Enforcement (SAGE) </w:t>
       </w:r>
       <w:r>
         <w:rPr>
@@ -1083,15 +979,7 @@
                             </w:r>
                             <w:r>
                               <w:br/>
-                              <w:t xml:space="preserve">    </w:t>
-                            </w:r>
-                            <w:proofErr w:type="spellStart"/>
-                            <w:r>
-                              <w:t>SimilarityToInput</w:t>
-                            </w:r>
-                            <w:proofErr w:type="spellEnd"/>
-                            <w:r>
-                              <w:t>,</w:t>
+                              <w:t xml:space="preserve">    SimilarityToInput,</w:t>
                             </w:r>
                             <w:r>
                               <w:br/>
@@ -1164,15 +1052,7 @@
                       </w:r>
                       <w:r>
                         <w:br/>
-                        <w:t xml:space="preserve">    </w:t>
-                      </w:r>
-                      <w:proofErr w:type="spellStart"/>
-                      <w:r>
-                        <w:t>SimilarityToInput</w:t>
-                      </w:r>
-                      <w:proofErr w:type="spellEnd"/>
-                      <w:r>
-                        <w:t>,</w:t>
+                        <w:t xml:space="preserve">    SimilarityToInput,</w:t>
                       </w:r>
                       <w:r>
                         <w:br/>
@@ -2360,7 +2240,15 @@
       </w:r>
       <w:r>
         <w:br/>
-        <w:t xml:space="preserve">    prev = state.Text</w:t>
+        <w:t xml:space="preserve">    </w:t>
+      </w:r>
+      <w:proofErr w:type="spellStart"/>
+      <w:r>
+        <w:t>prev</w:t>
+      </w:r>
+      <w:proofErr w:type="spellEnd"/>
+      <w:r>
+        <w:t xml:space="preserve"> = state.Text</w:t>
       </w:r>
       <w:r>
         <w:br/>
@@ -2508,7 +2396,31 @@
       </w:r>
       <w:r>
         <w:br/>
-        <w:t xml:space="preserve">    revised = llm.generate(skeptical_prompt(state.Text, state.Memory))</w:t>
+        <w:t xml:space="preserve">    revised = </w:t>
+      </w:r>
+      <w:proofErr w:type="spellStart"/>
+      <w:r>
+        <w:t>llm.generate</w:t>
+      </w:r>
+      <w:proofErr w:type="spellEnd"/>
+      <w:r>
+        <w:t>(</w:t>
+      </w:r>
+      <w:proofErr w:type="spellStart"/>
+      <w:r>
+        <w:t>skeptical_prompt</w:t>
+      </w:r>
+      <w:proofErr w:type="spellEnd"/>
+      <w:r>
+        <w:t>(</w:t>
+      </w:r>
+      <w:proofErr w:type="spellStart"/>
+      <w:r>
+        <w:t>state.Text</w:t>
+      </w:r>
+      <w:proofErr w:type="spellEnd"/>
+      <w:r>
+        <w:t>, state.Memory))</w:t>
       </w:r>
       <w:r>
         <w:br/>
@@ -5315,8 +5227,13 @@
       <w:proofErr w:type="spellEnd"/>
       <w:r>
         <w:br/>
-        <w:t xml:space="preserve"> ├── OmegaOperator</w:t>
-      </w:r>
+        <w:t xml:space="preserve"> ├── </w:t>
+      </w:r>
+      <w:proofErr w:type="spellStart"/>
+      <w:r>
+        <w:t>OmegaOperator</w:t>
+      </w:r>
+      <w:proofErr w:type="spellEnd"/>
       <w:r>
         <w:br/>
         <w:t xml:space="preserve"> ├── ChiOperator</w:t>
@@ -6038,10 +5955,7 @@
         <w:pStyle w:val="ListBullet"/>
       </w:pPr>
       <w:r>
-        <w:t>Persona adherence</w:t>
-      </w:r>
-      <w:r>
-        <w:t xml:space="preserve"> drift: Ω cycles amplify bias or hallucination.</w:t>
+        <w:t>Persona adherence drift: Ω cycles amplify bias or hallucination.</w:t>
       </w:r>
     </w:p>
     <w:p>
@@ -6728,12 +6642,12 @@
       </w:r>
     </w:p>
     <w:sectPr>
-      <w:headerReference w:type="even" r:id="rId10"/>
-      <w:headerReference w:type="default" r:id="rId11"/>
-      <w:footerReference w:type="even" r:id="rId12"/>
-      <w:footerReference w:type="default" r:id="rId13"/>
-      <w:headerReference w:type="first" r:id="rId14"/>
-      <w:footerReference w:type="first" r:id="rId15"/>
+      <w:headerReference w:type="even" r:id="rId8"/>
+      <w:headerReference w:type="default" r:id="rId9"/>
+      <w:footerReference w:type="even" r:id="rId10"/>
+      <w:footerReference w:type="default" r:id="rId11"/>
+      <w:headerReference w:type="first" r:id="rId12"/>
+      <w:footerReference w:type="first" r:id="rId13"/>
       <w:pgSz w:w="12240" w:h="15840" w:code="1"/>
       <w:pgMar w:top="1080" w:right="1224" w:bottom="1080" w:left="1224" w:header="864" w:footer="864" w:gutter="0"/>
       <w:cols w:space="720"/>
@@ -6873,7 +6787,15 @@
         <w:sz w:val="14"/>
         <w:szCs w:val="20"/>
       </w:rPr>
-      <w:t xml:space="preserve">Secure AI Guardrail Enforcement (SAIGE)                            </w:t>
+      <w:t xml:space="preserve">Secure AI Guardrail Enforcement </w:t>
+    </w:r>
+    <w:r>
+      <w:rPr>
+        <w:color w:val="5A5A5A"/>
+        <w:sz w:val="14"/>
+        <w:szCs w:val="20"/>
+      </w:rPr>
+      <w:t xml:space="preserve">(SAGE)                            </w:t>
     </w:r>
     <w:r>
       <w:rPr>
@@ -6917,7 +6839,7 @@
 <w:numbering xmlns:wpc="http://schemas.microsoft.com/office/word/2010/wordprocessingCanvas" xmlns:cx="http://schemas.microsoft.com/office/drawing/2014/chartex" xmlns:cx1="http://schemas.microsoft.com/office/drawing/2015/9/8/chartex" xmlns:cx2="http://schemas.microsoft.com/office/drawing/2015/10/21/chartex" xmlns:cx3="http://schemas.microsoft.com/office/drawing/2016/5/9/chartex" xmlns:cx4="http://schemas.microsoft.com/office/drawing/2016/5/10/chartex" xmlns:cx5="http://schemas.microsoft.com/office/drawing/2016/5/11/chartex" xmlns:cx6="http://schemas.microsoft.com/office/drawing/2016/5/12/chartex" xmlns:cx7="http://schemas.microsoft.com/office/drawing/2016/5/13/chartex" xmlns:cx8="http://schemas.microsoft.com/office/drawing/2016/5/14/chartex" xmlns:mc="http://schemas.openxmlformats.org/markup-compatibility/2006" xmlns:aink="http://schemas.microsoft.com/office/drawing/2016/ink" xmlns:am3d="http://schemas.microsoft.com/office/drawing/2017/model3d" xmlns:o="urn:schemas-microsoft-com:office:office" xmlns:oel="http://schemas.microsoft.com/office/2019/extlst" xmlns:r="http://schemas.openxmlformats.org/officeDocument/2006/relationships" xmlns:m="http://schemas.openxmlformats.org/officeDocument/2006/math" xmlns:v="urn:schemas-microsoft-com:vml" xmlns:wp14="http://schemas.microsoft.com/office/word/2010/wordprocessingDrawing" xmlns:wp="http://schemas.openxmlformats.org/drawingml/2006/wordprocessingDrawing" xmlns:w10="urn:schemas-microsoft-com:office:word" xmlns:w="http://schemas.openxmlformats.org/wordprocessingml/2006/main" xmlns:w14="http://schemas.microsoft.com/office/word/2010/wordml" xmlns:w15="http://schemas.microsoft.com/office/word/2012/wordml" xmlns:w16cex="http://schemas.microsoft.com/office/word/2018/wordml/cex" xmlns:w16cid="http://schemas.microsoft.com/office/word/2016/wordml/cid" xmlns:w16="http://schemas.microsoft.com/office/word/2018/wordml" xmlns:w16du="http://schemas.microsoft.com/office/word/2023/wordml/word16du" xmlns:w16sdtdh="http://schemas.microsoft.com/office/word/2020/wordml/sdtdatahash" xmlns:w16sdtfl="http://schemas.microsoft.com/office/word/2024/wordml/sdtformatlock" xmlns:w16se="http://schemas.microsoft.com/office/word/2015/wordml/symex" xmlns:wpg="http://schemas.microsoft.com/office/word/2010/wordprocessingGroup" xmlns:wpi="http://schemas.microsoft.com/office/word/2010/wordprocessingInk" xmlns:wne="http://schemas.microsoft.com/office/word/2006/wordml" xmlns:wps="http://schemas.microsoft.com/office/word/2010/wordprocessingShape" mc:Ignorable="w14 w15 w16se w16cid w16 w16cex w16sdtdh w16sdtfl w16du wp14">
   <w:numPicBullet w:numPicBulletId="0">
     <w:pict>
-      <v:shapetype w14:anchorId="6CED21EA" id="_x0000_t75" coordsize="21600,21600" o:spt="75" o:preferrelative="t" path="m@4@5l@4@11@9@11@9@5xe" filled="f" stroked="f">
+      <v:shapetype id="_x0000_t75" coordsize="21600,21600" o:spt="75" o:preferrelative="t" path="m@4@5l@4@11@9@11@9@5xe" filled="f" stroked="f">
         <v:stroke joinstyle="miter"/>
         <v:formulas>
           <v:f eqn="if lineDrawn pixelLineWidth 0"/>
@@ -7099,7 +7021,6 @@
     <w:lvl w:ilvl="0">
       <w:start w:val="1"/>
       <w:numFmt w:val="bullet"/>
-      <w:pStyle w:val="ListBullet"/>
       <w:lvlText w:val=""/>
       <w:lvlPicBulletId w:val="0"/>
       <w:lvlJc w:val="left"/>
@@ -8835,6 +8756,7 @@
   <w:style w:type="character" w:default="1" w:styleId="DefaultParagraphFont">
     <w:name w:val="Default Paragraph Font"/>
     <w:uiPriority w:val="1"/>
+    <w:semiHidden/>
     <w:unhideWhenUsed/>
   </w:style>
   <w:style w:type="table" w:default="1" w:styleId="TableNormal">

</xml_diff>